<commit_message>
Sync Office artefacts (manuscript / supplementary / tables-and-figures / Figure 1 pptx)
Bring the binary Office files in line with the most recent text-source
revisions and the editable Figure 1 deck.

Co-Authored-By: Claude Opus 4.7 (1M context) <noreply@anthropic.com>
</commit_message>
<xml_diff>
--- a/docs/HPV_manuscript.docx
+++ b/docs/HPV_manuscript.docx
@@ -294,7 +294,24 @@
           <w:sz w:val="22"/>
           <w:szCs w:val="22"/>
         </w:rPr>
-        <w:t xml:space="preserve">This is a single-centre observational cohort study that augments a prospectively maintained Korean HPV cervical-screening cohort with retrospective extraction from the institution's clinical data warehouse (CDW). Women were enrolled at the time of an index cervical evaluation between 2009 and 2024 and followed prospectively for cytology, histology, and HPV testing. Beginning in 2024, the CDW was queried to retrieve all linked diagnostic codes, surgical and pharmacy records, vital signs, anthropometric measurements, and laboratory values up to 31 December 2025, providing long-term outcome ascertainment beyond the original prospective protocol. Reporting follows the Strengthening the Reporting of Observational Studies in Epidemiology (STROBE) checklist for cohort studies. The institutional review board approved the protocol with a waiver of informed consent for the retrospective component (IRB number to be inserted).</w:t>
+        <w:t xml:space="preserve">This is a single-centre observational cohort study that augments a prospectively maintained Korean HPV cervical-screening cohort with retrospective extraction from the institution's clinical data warehouse (CDW). Women were enrolled at the time of an index cervical evaluation between 2009 and 2024 and followed prospectively for cytology, histology, and HPV testing. Beginning in 2024, the CDW was queried to retrieve all linked diagnostic codes, surgical and pharmacy records, vital signs, anthropometric measurements, and laboratory values up to 31 December 2025, providing long-term outcome ascertainment beyond the original prospective protocol. Reporting follows the Strengthening the Reporting of Observational Studies in Epidemiology (STROBE) checklist for cohort studies.</w:t>
+      </w:r>
+      <w:r>
+        <w:rPr>
+          <w:rFonts w:ascii="Arial" w:cs="Arial" w:eastAsia="Arial" w:hAnsi="Arial"/>
+          <w:sz w:val="22"/>
+          <w:szCs w:val="22"/>
+          <w:vertAlign w:val="superscript"/>
+        </w:rPr>
+        <w:t xml:space="preserve">1</w:t>
+      </w:r>
+      <w:r>
+        <w:rPr>
+          <w:rFonts w:ascii="Arial" w:cs="Arial" w:eastAsia="Arial" w:hAnsi="Arial"/>
+          <w:sz w:val="22"/>
+          <w:szCs w:val="22"/>
+        </w:rPr>
+        <w:t xml:space="preserve"> The institutional review board approved the protocol with a waiver of informed consent for the retrospective component (IRB number to be inserted).</w:t>
       </w:r>
     </w:p>
     <w:p>
@@ -358,7 +375,7 @@
           <w:sz w:val="22"/>
           <w:szCs w:val="22"/>
         </w:rPr>
-        <w:t xml:space="preserve">HPV vaccination status was determined from the prescription file using a keyword search for the brand names "Gardasil", "Gardasil 9", and "Cervarix" (and the corresponding Korean transliterations 가다실 and 서바릭스). Among the 32,969 women in the source population, 2,156 (6.5%) had at least one HPV-vaccine dispensation; of these, 53.1% received the nine-valent product (Gardasil 9), 32.0% the bivalent product (Cervarix), and 14.9% the quadrivalent product (Gardasil). The date of the first dispensation was used as the exposure index date. Women with no vaccine record at any time were classified as unvaccinated.</w:t>
+        <w:t xml:space="preserve">HPV vaccination status was determined from the prescription file using two parallel definitions: a keyword search for the brand names "Gardasil", "Gardasil 9", and "Cervarix" (with the corresponding Korean transliterations 가다실 and 서바릭스), and an independent search on the institution-specific drug-code prefixes (`DV-JHP` for Cervarix, `DV-HPF` for the quadrivalent Gardasil, `DV-9HPF` for Gardasil 9), which together covered six distinct codes including variants for free-of-charge and employee/family vaccination. The two definitions identified an identical set of 2,156 women (concordance 100%; Supplementary Table on prescription-code validation), supporting a robust exposure ascertainment. Among the 32,969 women in the source population, these 2,156 (6.5%) had received at least one HPV-vaccine dispensation; attributing each woman by her first-dose product, 42.2% (n = 909) received the nine-valent vaccine (Gardasil 9), 40.4% (n = 870) the bivalent vaccine (Cervarix), and 17.5% (n = 377) the quadrivalent vaccine (Gardasil). A total of 5,514 vaccine doses were recorded, with a median of 3 doses per vaccinated woman (interquartile range 2–3, range 1–6); 80% completed the standard three-dose schedule. Thirty-three women (1.5%) received doses of more than one product (Gardasil 9 + quadrivalent Gardasil n = 21, Gardasil 9 + Cervarix n = 10, quadrivalent Gardasil + Cervarix n = 2); for the vaccine-type subgroup analysis these women were attributed by their first dose. The date of the first dispensation was used as the exposure index date. Women with no vaccine record at any time were classified as unvaccinated.</w:t>
       </w:r>
     </w:p>
     <w:p>
@@ -415,7 +432,24 @@
           <w:sz w:val="22"/>
           <w:szCs w:val="22"/>
         </w:rPr>
-        <w:t xml:space="preserve"> addressed the long-term safety question—whether HPV vaccination is associated with the incidence of major chronic conditions during follow-up—and was constructed from the entire source population. Eligibility required available date of birth, survival until the index date, and at least one day of follow-up thereafter. For unvaccinated women, who do not have an intrinsic exposure date, a pseudo index date was assigned by random sampling from the empirical distribution of first-vaccination dates among vaccinated women, so that all time-anchored covariates and outcomes could be evaluated on a comparable temporal frame. Propensity scores for receipt of vaccination were estimated by logistic regression on age at index, body-mass index, systolic and diastolic blood pressure (with mean imputation and missing-value indicators for each), smoking status (never, former, current, or unknown, with unknown as the reference category), and residence in Seoul. One-to-one nearest-neighbour matching on the logit of the propensity score was performed without replacement using a caliper of 0.2 times the standard deviation of the logit, in accordance with the recommendation of Austin (2011). The final matched Cohort A comprised 2,051 vaccinated and 2,051 unvaccinated women.</w:t>
+        <w:t xml:space="preserve"> addressed the long-term safety question—whether HPV vaccination is associated with the incidence of major chronic conditions during follow-up—and was constructed from the entire source population. Eligibility required available date of birth, survival until the index date, and at least one day of follow-up thereafter. For unvaccinated women, who do not have an intrinsic exposure date, a pseudo index date was assigned by random sampling from the empirical distribution of first-vaccination dates among vaccinated women, so that all time-anchored covariates and outcomes could be evaluated on a comparable temporal frame. Propensity scores for receipt of vaccination were estimated by logistic regression on age at index, body-mass index, systolic and diastolic blood pressure (with mean imputation and missing-value indicators for each), smoking status (never, former, current, or unknown, with unknown as the reference category), and residence in Seoul. One-to-one nearest-neighbour matching on the logit of the propensity score was performed without replacement using a caliper of 0.2 times the standard deviation of the logit, in accordance with the recommendation of Austin.</w:t>
+      </w:r>
+      <w:r>
+        <w:rPr>
+          <w:rFonts w:ascii="Arial" w:cs="Arial" w:eastAsia="Arial" w:hAnsi="Arial"/>
+          <w:sz w:val="22"/>
+          <w:szCs w:val="22"/>
+          <w:vertAlign w:val="superscript"/>
+        </w:rPr>
+        <w:t xml:space="preserve">2</w:t>
+      </w:r>
+      <w:r>
+        <w:rPr>
+          <w:rFonts w:ascii="Arial" w:cs="Arial" w:eastAsia="Arial" w:hAnsi="Arial"/>
+          <w:sz w:val="22"/>
+          <w:szCs w:val="22"/>
+        </w:rPr>
+        <w:t xml:space="preserve"> The final matched Cohort A comprised 2,051 vaccinated and 2,051 unvaccinated women.</w:t>
       </w:r>
     </w:p>
     <w:p>
@@ -440,7 +474,7 @@
           <w:sz w:val="22"/>
           <w:szCs w:val="22"/>
         </w:rPr>
-        <w:t xml:space="preserve"> addressed the post-surgical efficacy question and was restricted to the 6,890 women who had undergone cervical conization or hysterectomy for histologically confirmed HSIL/CIN3 or higher disease. Vaccinated and unvaccinated women were matched in two steps. An initial 1:5 match required exact agreement on surgical procedure (conization or hysterectomy) and matching on calendar year of surgery within ±1 year and on age at surgery within ±5 years. Index dates were then assigned: the first vaccination date for vaccinated women, and the surgery date plus the matched vaccinated woman's surgery-to-vaccination interval for unvaccinated controls (the pseudo index date, preserving the immortal-time correspondence between groups). Eligibility required an index date on or before 31 December 2020 to ensure at least five years of potential follow-up, and at least two follow-up records. After this filter, a fine 1:4 match further balanced the groups on age at index, body-mass index nearest the index date, and surgery year. The final Cohort B comprised 241 vaccinated and 867 unvaccinated women.</w:t>
+        <w:t xml:space="preserve"> addressed the post-surgical efficacy question and was restricted to the 6,890 women who had undergone cervical conization or hysterectomy for histologically confirmed HSIL/CIN3 or higher disease. Vaccinated and unvaccinated women were matched in two steps using a variable-ratio (greedy, without-replacement) algorithm. An initial 1:up-to-5 match required exact agreement on surgical procedure (conization or hysterectomy), and on calendar year of surgery within ±1 year and age at surgery within ±5 years; up to five unvaccinated controls were drawn for each vaccinated case from the eligible pool, with controls ordered by combined age- and year-distance and selected without replacement. The maximum ratio of five was reached for 256 of 411 vaccinated cases (62%); the remaining 155 cases received fewer controls (range 0–4) because their surgery-method × surgery-year × age cell contained too few unvaccinated comparators or because earlier matches had exhausted the available pool, yielding a mean ratio of 4.42 controls per case (411 vaccinated and 1,815 unvaccinated). Index dates were then assigned: the first vaccination date for vaccinated women, and the surgery date plus the matched vaccinated woman's surgery-to-vaccination interval for unvaccinated controls (the pseudo index date, preserving the immortal-time correspondence between groups). Eligibility required an index date on or before 31 December 2020 to ensure at least five years of potential follow-up, and at least two follow-up records. After this filter, a fine 1:up-to-4 match further balanced the groups on age at index (±5 years), body-mass index nearest the index date (±3 kg/m²), and surgery year (±1 year), with candidates ranked by a normalized composite distance and selected without replacement. The maximum ratio of four was reached for 193 of 241 vaccinated cases (80%); the remaining 48 cases received one to three controls, yielding a mean ratio of 3.60. The final Cohort B comprised 241 vaccinated and 867 unvaccinated women.</w:t>
       </w:r>
     </w:p>
     <w:p>
@@ -487,7 +521,7 @@
           <w:sz w:val="22"/>
           <w:szCs w:val="22"/>
         </w:rPr>
-        <w:t xml:space="preserve">In Cohort B, the two pre-specified primary outcomes were biopsy-confirmed lesion recurrence (defined as a HSIL, CIN3, or invasive cervical cancer diagnosis after the index date) and new high-risk HPV infection (defined as positivity for any of the 14 high-risk types: 16, 18, 31, 33, 35, 39, 45, 51, 52, 56, 58, 59, 66, and 68). Time was censored at last follow-up, death, loss to follow-up, or 31 December 2025, whichever occurred first.</w:t>
+        <w:t xml:space="preserve">In Cohort B, the two pre-specified primary outcomes were biopsy-confirmed lesion recurrence (defined as a HSIL, CIN3, or invasive cervical cancer diagnosis after the index date) and post-index detection of any high-risk HPV type, ascertained from the first pathology record positive for any of the 14 high-risk types (16, 18, 31, 33, 35, 39, 45, 51, 52, 56, 58, 59, 66, 68) occurring after the index date. We refer to this outcome as "post-index hr-HPV detection"; because the cohort consisted of women who had been HPV-positive at the time of the qualifying surgery and who typically clear residual viral DNA over 12–18 months, this composite outcome necessarily captures both persistence or reactivation of the pre-surgical infection and new acquisition. To separate these components, we pre-specified a landmark sensitivity analysis (see Statistical analysis) in which the at-risk clock for the HPV outcome was advanced to 6, 12, and 24 months post-index, on the rationale that detections beyond 12 months are progressively more likely to represent new acquisition than residual viral material. Time was censored at last follow-up, death, loss to follow-up, or 31 December 2025, whichever occurred first.</w:t>
       </w:r>
     </w:p>
     <w:p>
@@ -534,7 +568,24 @@
           <w:sz w:val="22"/>
           <w:szCs w:val="22"/>
         </w:rPr>
-        <w:t xml:space="preserve">For Cohort A, cumulative incidence functions were estimated non-parametrically with the Aalen–Johansen estimator, which yields consistent estimates in the presence of competing events. Cause-specific hazard ratios were obtained by Cox proportional-hazards regression treating the competing event of death as right censoring, with cluster-robust standard errors using the matched pair as the cluster variable to reflect the dependence induced by 1:1 matching. Subdistribution hazard ratios were obtained from the Fine–Gray model implemented as time-varying Cox regression on a Geskus-reweighted dataset, in which subjects experiencing the competing event are retained in the risk set with inverse-probability-of-censoring weights derived from the Kaplan–Meier estimate of the censoring distribution. Outcomes with fewer than five events in either group were reported descriptively and not modelled. For Cohort B, Kaplan–Meier estimators with log-rank tests were used to compare time-to-event curves, and Cox proportional-hazards models adjusted for age at index were used to estimate hazard ratios with 95% confidence intervals, again with cluster-robust standard errors using the fine-matching identifier as the cluster variable. The proportional-hazards assumption was assessed for all primary models by the Schoenfeld residual rank test and inspected graphically by scaled-Schoenfeld plots; results are reported in Supplementary Table S7 and Supplementary Figures S5–S6. Person-years were accumulated from the index date to the first event, death, or last follow-up, and incidence rates per 1,000 person-years are reported alongside hazard ratios.</w:t>
+        <w:t xml:space="preserve">For Cohort A, cumulative incidence functions were estimated non-parametrically with the Aalen–Johansen estimator, which yields consistent estimates in the presence of competing events. Cause-specific hazard ratios were obtained by Cox proportional-hazards regression treating the competing event of death as right censoring, with cluster-robust standard errors using the matched pair as the cluster variable to reflect the dependence induced by 1:1 matching. Subdistribution hazard ratios were obtained from the Fine–Gray model implemented as time-varying Cox regression on a Geskus-reweighted dataset,</w:t>
+      </w:r>
+      <w:r>
+        <w:rPr>
+          <w:rFonts w:ascii="Arial" w:cs="Arial" w:eastAsia="Arial" w:hAnsi="Arial"/>
+          <w:sz w:val="22"/>
+          <w:szCs w:val="22"/>
+          <w:vertAlign w:val="superscript"/>
+        </w:rPr>
+        <w:t xml:space="preserve">3</w:t>
+      </w:r>
+      <w:r>
+        <w:rPr>
+          <w:rFonts w:ascii="Arial" w:cs="Arial" w:eastAsia="Arial" w:hAnsi="Arial"/>
+          <w:sz w:val="22"/>
+          <w:szCs w:val="22"/>
+        </w:rPr>
+        <w:t xml:space="preserve"> in which subjects experiencing the competing event are retained in the risk set with inverse-probability-of-censoring weights derived from the Kaplan–Meier estimate of the censoring distribution. Outcomes with fewer than five events in either group were reported descriptively and not modelled. For Cohort B, the cumulative incidence of each outcome was estimated as the complement of the Kaplan–Meier survival function (1 − S(t)), and Cox proportional-hazards models adjusted for age at index were used to estimate hazard ratios with 95% confidence intervals, with cluster-robust standard errors using the fine-matching identifier as the cluster variable; deaths during follow-up were rare in this young post-surgical population, so 1 − S(t) approximates the Aalen–Johansen cause-specific cumulative incidence to within rounding error. The proportional-hazards assumption was assessed for all primary models by the Schoenfeld residual rank test and inspected graphically by scaled-Schoenfeld plots; results are reported in Supplementary Table S7 and Supplementary Figures S5–S6. Person-years were accumulated from the index date to the first event, death, or last follow-up, and incidence rates per 1,000 person-years are reported alongside hazard ratios.</w:t>
       </w:r>
     </w:p>
     <w:p>
@@ -549,7 +600,24 @@
           <w:sz w:val="22"/>
           <w:szCs w:val="22"/>
         </w:rPr>
-        <w:t xml:space="preserve">Because the two Cohort B primary outcomes constitute a small pre-specified family, p values were Bonferroni-adjusted (k = 2) and 97.5% confidence intervals are reported in addition to nominal 95% intervals. Heterogeneity of vaccine effect across vaccine types was tested in Cohort B by fitting a single Cox model with main effects for vaccination, vaccine-type indicators (Gardasil 9 as reference), age at index, and vaccine-type × vaccination interaction terms, and comparing this against a reduced model without the interaction terms by likelihood-ratio test (LRT). This single-model formulation avoids the dependence among non-vaccinated controls that would otherwise be reused across pairwise vaccine-specific subgroups. Subgroup analyses by age band with 2-year landmark censoring were retained as exploratory and were not adjusted for multiple comparisons; their findings are interpreted as hypothesis-generating.</w:t>
+        <w:t xml:space="preserve">In line with the prevailing convention in observational epidemiology, no formal multiple-comparison adjustment (e.g., Bonferroni or false-discovery-rate procedure) was applied to the two Cohort B primary outcomes. Lesion recurrence and high-risk HPV reinfection address distinct biological questions—reactivation or persistence of pre-existing transformed clones versus de novo viral acquisition—and were therefore treated as separate, pre-specified hypotheses rather than members of a single confirmatory family, consistent with the long-standing argument that family-wise error rate control is rarely informative for hypothesis-driven epidemiology</w:t>
+      </w:r>
+      <w:r>
+        <w:rPr>
+          <w:rFonts w:ascii="Arial" w:cs="Arial" w:eastAsia="Arial" w:hAnsi="Arial"/>
+          <w:sz w:val="22"/>
+          <w:szCs w:val="22"/>
+          <w:vertAlign w:val="superscript"/>
+        </w:rPr>
+        <w:t xml:space="preserve">4</w:t>
+      </w:r>
+      <w:r>
+        <w:rPr>
+          <w:rFonts w:ascii="Arial" w:cs="Arial" w:eastAsia="Arial" w:hAnsi="Arial"/>
+          <w:sz w:val="22"/>
+          <w:szCs w:val="22"/>
+        </w:rPr>
+        <w:t xml:space="preserve"> and with the absence of a multiplicity item in the STROBE reporting guideline. We report nominal p values throughout and explicitly disclose the number of primary tests so that readers may apply their preferred adjustment if desired. Heterogeneity of vaccine effect across vaccine types was tested in Cohort B by fitting a single Cox model with main effects for vaccination, vaccine-type indicators (Gardasil 9 as reference), age at index, and vaccine-type × vaccination interaction terms, and comparing this against a reduced model without the interaction terms by likelihood-ratio test (LRT). This single-model formulation avoids the dependence among non-vaccinated controls that would otherwise be reused across pairwise vaccine-specific subgroups. Subgroup analyses by age band with 2-year landmark censoring are explicitly reported as exploratory and hypothesis-generating.</w:t>
       </w:r>
     </w:p>
     <w:p>
@@ -565,6 +633,38 @@
           <w:szCs w:val="22"/>
         </w:rPr>
         <w:t xml:space="preserve">To assess robustness of the Cohort A pseudo-index assignment, a sensitivity analysis compared three strategies for assigning an index date to non-vaccinated controls: (i) random sampling from the empirical distribution of vaccinated patients' first-vaccination dates (primary); (ii) calendar-year-matched random sampling, restricting the donor pool to vaccinated patients whose vaccine year preceded the control's last-follow-up year; and (iii) risk-set sampling, which assigns each vaccinated patient's actual vaccination date to a control alive and observable on that date. The note "as-treated" is avoided because the analysis is, by design, anchored to the date of first vaccine receipt; results from a true intention-to-treat formulation are not pertinent in this single-arm exposure-ascertained setting.</w:t>
+      </w:r>
+    </w:p>
+    <w:p>
+      <w:pPr>
+        <w:spacing w:after="0" w:line="480"/>
+        <w:ind w:firstLine="800"/>
+        <w:jc w:val="both"/>
+      </w:pPr>
+      <w:r>
+        <w:rPr>
+          <w:rFonts w:ascii="Arial" w:cs="Arial" w:eastAsia="Arial" w:hAnsi="Arial"/>
+          <w:sz w:val="22"/>
+          <w:szCs w:val="22"/>
+        </w:rPr>
+        <w:t xml:space="preserve">Four additional sensitivity analyses addressed the exposure, matching, and outcome definitions. First, the primary "≥1 dose" exposure definition was tightened to require ≥2 and ≥3 (complete schedule) doses, with the unvaccinated arm held fixed and the Cox models refit; this analysis was conducted separately in Cohort A (all five chronic-disease endpoints and the two composites) and in Cohort B (both primary outcomes). Second, the variable-ratio (1:up-to-4) primary fine-matching procedure for Cohort B was compared against a strict fixed 1:4 alternative that retained only those vaccinated cases for whom four controls had been identified, dropping cases with one to three controls together with their attached non-vaccinated participants. Variable-ratio matching was specified as the primary approach because the limited number of vaccinated surgical cases (n = 241) and the small absolute event count (13 lesion recurrences) make full retention of matchable cases preferable, while the cluster-robust standard errors using the matching identifier appropriately accommodate the unequal cluster sizes.</w:t>
+      </w:r>
+      <w:r>
+        <w:rPr>
+          <w:rFonts w:ascii="Arial" w:cs="Arial" w:eastAsia="Arial" w:hAnsi="Arial"/>
+          <w:sz w:val="22"/>
+          <w:szCs w:val="22"/>
+          <w:vertAlign w:val="superscript"/>
+        </w:rPr>
+        <w:t xml:space="preserve">5,6</w:t>
+      </w:r>
+      <w:r>
+        <w:rPr>
+          <w:rFonts w:ascii="Arial" w:cs="Arial" w:eastAsia="Arial" w:hAnsi="Arial"/>
+          <w:sz w:val="22"/>
+          <w:szCs w:val="22"/>
+        </w:rPr>
+        <w:t xml:space="preserve"> Third, the prescription-code validation described above served as a sensitivity check for the exposure definition. Fourth, to separate persistence of the pre-surgical infection from genuine new acquisition in the post-index hr-HPV detection outcome, a landmark sensitivity analysis re-estimated the Cox HR after advancing the at-risk clock to 6, 12, and 24 months post-index. In each landmark analysis, women who had already had a positive hr-HPV record before the landmark, and women whose follow-up ended before the landmark, were excluded; for the remaining women, time at risk was measured from the landmark to the first hr-HPV+ record or the end of follow-up. Results of all four sensitivity analyses are reported in the supplementary material (Supplementary Tables on dose threshold, strict matching, prescription-code validation, and HPV outcome landmark).</w:t>
       </w:r>
     </w:p>
     <w:p>
@@ -628,7 +728,7 @@
           <w:sz w:val="22"/>
           <w:szCs w:val="22"/>
         </w:rPr>
-        <w:t xml:space="preserve">A total of 32,969 women contributed to the source population, of whom 2,156 (6.5%) had received at least one HPV vaccination during follow-up. Application of the two matching strategies yielded the final analytic cohorts: Cohort A comprised 4,102 women (2,051 vaccinated and 2,051 unvaccinated, propensity-score matched 1:1) and Cohort B comprised 1,108 women (241 vaccinated and 867 finely matched controls, 1:4 ratio). The full selection process is shown in </w:t>
+        <w:t xml:space="preserve">A total of 32,969 women contributed to the source population, of whom 2,156 (6.5%) had received at least one HPV vaccination during follow-up. Application of the two matching strategies yielded the final analytic cohorts: Cohort A comprised 4,102 women (2,051 vaccinated and 2,051 unvaccinated, propensity-score matched 1:1) and Cohort B comprised 1,108 women (241 vaccinated and 867 finely matched controls, mean variable ratio 3.60:1, maximum 4:1). The full selection process is shown in </w:t>
       </w:r>
       <w:r>
         <w:rPr>
@@ -694,7 +794,7 @@
           <w:sz w:val="22"/>
           <w:szCs w:val="22"/>
         </w:rPr>
-        <w:t xml:space="preserve">In Cohort B, the fine matching yielded near-perfect balance on all matching variables. Mean age at the index date was 37.3 (9.5) years in the vaccinated group and 37.2 (8.5) years in controls (|SMD| = 0.01); body-mass index averaged 22.3 kg/m² in both groups (|SMD| = 0.02); over 99% of women in both groups had undergone conization rather than hysterectomy (|SMD| = 0.04). Median follow-up was 2,234 days (approximately 6.1 years) in vaccinated women and 2,236 days in controls.</w:t>
+        <w:t xml:space="preserve">In Cohort B, the fine matching yielded near-perfect balance on all matching variables. Mean age at the index date was 37.3 (9.5) years in the vaccinated group and 37.2 (8.5) years in controls (|SMD| = 0.01); body-mass index averaged 22.3 kg/m² in both groups (|SMD| = 0.02); over 99% of women in both groups had undergone conization rather than hysterectomy (|SMD| = 0.04). Median follow-up was 4.88 years (interquartile range 3.33 to 8.57; mean 6.12) in vaccinated women and 5.02 years (interquartile range 3.42 to 8.71; mean 6.12) in controls, with maximum observed follow-up of approximately 15 years.</w:t>
       </w:r>
     </w:p>
     <w:p>
@@ -791,7 +891,7 @@
           <w:sz w:val="22"/>
           <w:szCs w:val="22"/>
         </w:rPr>
-        <w:t xml:space="preserve">Over a mean follow-up of approximately 6.1 years per participant (1,474 person-years in vaccinated and 5,308 person-years in unvaccinated women), 70 women experienced biopsy-confirmed lesion recurrence (13 of 241 vaccinated, incidence rate 8.82 per 1,000 person-years; 57 of 867 controls, 10.74 per 1,000 person-years) and 695 experienced a new high-risk HPV infection (149 vaccinated, 101.08 per 1,000 person-years; 546 controls, 102.86 per 1,000 person-years). In age-adjusted Cox models with cluster-robust standard errors using the fine-matching identifier, vaccination was not significantly associated with recurrence (hazard ratio 0.76, 95% confidence interval 0.43 to 1.33, p = 0.34; Bonferroni-adjusted p = 0.67; 97.5% CI 0.40 to 1.44) or with HPV reinfection (hazard ratio 0.97, 95% CI 0.83 to 1.14, p = 0.71; Bonferroni-adjusted p &gt; 0.99; 97.5% CI 0.81 to 1.16). The Schoenfeld residual rank test did not indicate violation of the proportional-hazards assumption for either outcome (p = 0.59 for recurrence and p = 0.12 for HPV reinfection on the vaccinated covariate). Kaplan–Meier curves and the corresponding hazard ratios are shown in </w:t>
+        <w:t xml:space="preserve">Over a median follow-up of 4.88 years (interquartile range 3.33 to 8.57) in the vaccinated group and 5.02 years (3.42 to 8.71) in controls, contributing 1,474 vaccinated and 5,308 unvaccinated person-years, 70 women experienced biopsy-confirmed lesion recurrence (13 of 241 vaccinated, incidence rate 8.82 per 1,000 person-years; 57 of 867 controls, 10.74 per 1,000 person-years) and 695 experienced a new high-risk HPV infection (149 vaccinated, 101.08 per 1,000 person-years; 546 controls, 102.86 per 1,000 person-years). In age-adjusted Cox models with cluster-robust standard errors using the fine-matching identifier, vaccination was not significantly associated with recurrence (hazard ratio 0.76, 95% confidence interval 0.43 to 1.33, p = 0.34) or with HPV reinfection (hazard ratio 0.97, 95% confidence interval 0.83 to 1.14, p = 0.71). The Schoenfeld residual rank test did not indicate violation of the proportional-hazards assumption for either outcome (p = 0.59 for recurrence and p = 0.12 for HPV reinfection on the vaccinated covariate). Cumulative incidence curves and the corresponding hazard ratios are shown in </w:t>
       </w:r>
       <w:r>
         <w:rPr>
@@ -842,7 +942,7 @@
           <w:sz w:val="22"/>
           <w:szCs w:val="22"/>
         </w:rPr>
-        <w:t xml:space="preserve">To formally test heterogeneity by vaccine type while avoiding the dependence created by reusing non-vaccinated controls across pairwise vaccine subgroups, we fitted a single age-adjusted Cox model with vaccination, vaccine-type indicators (Gardasil 9 reference), and vaccine-type × vaccination interaction terms; the matched cluster identifier was used for robust standard errors. The likelihood-ratio test for vaccine-type heterogeneity was non-significant for lesion recurrence (χ² = 0.27 on 2 degrees of freedom, p = 0.87) but significant for HPV reinfection (χ² = 6.60 on 2 degrees of freedom, p = 0.037), supporting differential effects across products for the latter outcome (</w:t>
+        <w:t xml:space="preserve">Pre-specified subgroup analyses by age at index (&lt;40, 40–49, ≥50 years) and by vaccine type (Gardasil 9, Cervarix, quadrivalent Gardasil) are presented as a single combined forest plot for both primary outcomes (</w:t>
       </w:r>
       <w:r>
         <w:rPr>
@@ -860,7 +960,37 @@
           <w:sz w:val="22"/>
           <w:szCs w:val="22"/>
         </w:rPr>
-        <w:t xml:space="preserve">). Within this single-model formulation the type-specific HPV-reinfection hazard ratios were 1.10 for Gardasil 9 (95% CI 0.90 to 1.33), 1.11 for Cervarix (95% CI 0.81 to 1.51), and 0.49 for Gardasil (95% CI 0.26 to 0.93), in line with the previously observed quadrivalent-specific protective signal. As an additional exploratory analysis, an age-stratified landmark analysis restricting follow-up to two years showed a significant reduction in lesion recurrence among women aged 30 to 52 years (hazard ratio 0.23, 95% confidence interval 0.06 to 0.96, p = 0.04), with similar point estimates for adjacent age ranges (Supplementary Table S4). Both subgroup findings are interpreted as hypothesis-generating because they were not pre-specified for multiple-comparison adjustment.</w:t>
+        <w:t xml:space="preserve">). To formally test heterogeneity by vaccine type while avoiding the dependence created by reusing non-vaccinated controls across pairwise vaccine subgroups, we fitted a single age-adjusted Cox model with vaccination, vaccine-type indicators (Gardasil 9 reference), and vaccine-type × vaccination interaction terms; the matched cluster identifier was used for robust standard errors. The likelihood-ratio test for vaccine-type heterogeneity was non-significant for lesion recurrence (χ² = 0.27 on 2 degrees of freedom, p = 0.87) but significant for HPV reinfection (χ² = 6.60 on 2 degrees of freedom, p = 0.037), supporting differential effects across products for the latter outcome. Within this single-model formulation the type-specific HPV-reinfection hazard ratios were 1.10 for Gardasil 9 (95% CI 0.90 to 1.33), 1.11 for Cervarix (95% CI 0.81 to 1.51), and 0.49 for the quadrivalent Gardasil (95% CI 0.26 to 0.93), in line with the previously observed quadrivalent-specific protective signal. Within the pre-specified age strata, none of the subgroups reached the nominal 0.05 threshold for lesion recurrence, and the test for age × vaccination interaction was non-significant for both outcomes (lesion recurrence p = 0.19; HPV reinfection p = 0.15). Both the vaccine-type interaction signal and the age-stratified subgroup pattern are interpreted as hypothesis-generating findings rather than confirmatory; a separate exploratory finding identified by a grid search over many overlapping age ranges and follow-up windows (a 2-year-censored estimate among women aged 30 to 52 years, hazard ratio 0.23, 95% CI 0.06 to 0.96, p = 0.04) is acknowledged in the limitations section as a single nominally significant cell among approximately 6,900 combinations tested (overall significance rate 0.2%), is not displayed in the main figure, and is not used to support any inference.</w:t>
+      </w:r>
+    </w:p>
+    <w:p>
+      <w:pPr>
+        <w:spacing w:after="0" w:line="480"/>
+        <w:ind w:firstLine="800"/>
+        <w:jc w:val="both"/>
+      </w:pPr>
+      <w:r>
+        <w:rPr>
+          <w:rFonts w:ascii="Arial" w:cs="Arial" w:eastAsia="Arial" w:hAnsi="Arial"/>
+          <w:sz w:val="22"/>
+          <w:szCs w:val="22"/>
+        </w:rPr>
+        <w:t xml:space="preserve">Sensitivity analyses corroborated the primary findings. Restricting the vaccinated arm to women with at least two and at least three (complete schedule) recorded doses produced a monotonic strengthening of the lesion-recurrence point estimate (hazard ratios 0.71 and 0.61 at the two thresholds, both with non-significant 95% confidence intervals) and essentially unchanged estimates for HPV reinfection (hazard ratios 0.96 and 1.02), so that no dose-completeness scenario altered the qualitative conclusions (Supplementary Table on dose threshold). A strict 1:4 fine-matched alternative dropped 48 of 241 vaccinated cases (20%) and approximately 16% of recurrence events but yielded essentially identical hazard ratio estimates (lesion recurrence 0.69, 95% CI 0.36–1.33; HPV reinfection 0.94, 95% CI 0.79–1.12), supporting the choice of the variable-ratio primary specification (Supplementary Table on strict matching).</w:t>
+      </w:r>
+    </w:p>
+    <w:p>
+      <w:pPr>
+        <w:spacing w:after="0" w:line="480"/>
+        <w:ind w:firstLine="800"/>
+        <w:jc w:val="both"/>
+      </w:pPr>
+      <w:r>
+        <w:rPr>
+          <w:rFonts w:ascii="Arial" w:cs="Arial" w:eastAsia="Arial" w:hAnsi="Arial"/>
+          <w:sz w:val="22"/>
+          <w:szCs w:val="22"/>
+        </w:rPr>
+        <w:t xml:space="preserve">The pre-specified landmark sensitivity for the post-index hr-HPV detection outcome, designed to separate persistence of the pre-surgical infection from new acquisition, modified the inference. Of the 695 women with any post-index hr-HPV positivity, 326 (47%) had their first positive record within 6 months of the index date and 494 (71%) within 12 months — a temporal pattern more consistent with incomplete clearance of the pre-surgical infection than with new acquisition, as the latter would be expected to accumulate gradually over time. When the at-risk clock was advanced to 6 months, 12 months, and 24 months post-index, the age-adjusted hazard ratio for vaccination shifted toward the null and slightly above unity in each case (HR 1.18, 95% CI 0.94–1.48 at 6 months; HR 1.15, 95% CI 0.84–1.57 at 12 months; HR 1.08, 95% CI 0.74–1.57 at 24 months; Supplementary Table on HPV outcome landmark). The slight protective trend in the primary HR (0.91) is therefore plausibly attributable to faster clearance of pre-surgical viral DNA in the vaccinated arm rather than to protection against new HPV acquisition, and we interpret the data as showing no evidence of post-surgical vaccine efficacy against new high-risk HPV acquisition in this cohort.</w:t>
       </w:r>
     </w:p>
     <w:p>
@@ -897,6 +1027,21 @@
     </w:p>
     <w:p>
       <w:pPr>
+        <w:spacing w:after="0" w:line="480"/>
+        <w:ind/>
+        <w:jc w:val="both"/>
+      </w:pPr>
+      <w:r>
+        <w:rPr>
+          <w:rFonts w:ascii="Arial" w:cs="Arial" w:eastAsia="Arial" w:hAnsi="Arial"/>
+          <w:sz w:val="22"/>
+          <w:szCs w:val="22"/>
+        </w:rPr>
+        <w:t xml:space="preserve">(planned)</w:t>
+      </w:r>
+    </w:p>
+    <w:p>
+      <w:pPr>
         <w:spacing w:after="120" w:before="240" w:line="480"/>
       </w:pPr>
       <w:r>
@@ -942,7 +1087,7 @@
           <w:sz w:val="22"/>
           <w:szCs w:val="22"/>
         </w:rPr>
-        <w:t xml:space="preserve">. CONSORT-style cohort selection flow diagram showing derivation of Cohort A (whole-cohort safety analysis) and Cohort B (post-surgical efficacy analysis) from the single source population (Mermaid diagram in `docs/Methods_CohortSelection.md`; export to PNG for submission).
+        <w:t xml:space="preserve">. CONSORT-style cohort selection flow diagram showing derivation of Cohort A (whole-cohort safety analysis) and Cohort B (post-surgical efficacy analysis) from the single source population. File: `Data/Figure1_CohortSelection.png`.
 - </w:t>
       </w:r>
       <w:r>
@@ -961,7 +1106,7 @@
           <w:sz w:val="22"/>
           <w:szCs w:val="22"/>
         </w:rPr>
-        <w:t xml:space="preserve">. Cumulative incidence functions (Aalen–Johansen estimator) and forest plot of cause-specific and Fine–Gray subdistribution hazard ratios for Cohort A. File: `Data/cohort_a_psm_cif_hr.png`.
+        <w:t xml:space="preserve">. Cumulative incidence functions (Aalen–Johansen estimator) and forest plot of cause-specific and Fine–Gray subdistribution hazard ratios for Cohort A. File: `Data/Figure2_CohortA_CIF_HR.png`.
 - </w:t>
       </w:r>
       <w:r>
@@ -980,7 +1125,7 @@
           <w:sz w:val="22"/>
           <w:szCs w:val="22"/>
         </w:rPr>
-        <w:t xml:space="preserve">. Kaplan–Meier survival curves for biopsy-confirmed lesion recurrence and high-risk HPV reinfection in Cohort B. File: `Data/figure1_kaplan_meier.png`.
+        <w:t xml:space="preserve">. Cumulative incidence (1 − Kaplan–Meier) curves with number-at-risk tables for biopsy-confirmed lesion recurrence and high-risk HPV reinfection in Cohort B. File: `Data/Figure3_CohortB_CIF.png`.
 - </w:t>
       </w:r>
       <w:r>
@@ -999,7 +1144,7 @@
           <w:sz w:val="22"/>
           <w:szCs w:val="22"/>
         </w:rPr>
-        <w:t xml:space="preserve">. Forest plot of hazard ratios by vaccine type (Gardasil 9, Cervarix, Gardasil) for both Cohort B outcomes. File: `Data/figure5_vaccine_forest.png`.
+        <w:t xml:space="preserve">. Combined subgroup forest plot for Cohort B (Overall, by age at index, by vaccine type), reported separately for lesion recurrence and HPV reinfection in a JAMA-style table-with-forest layout including event counts, hazard ratios with 95% confidence intervals, and the likelihood-ratio test for interaction. File: `Data/Figure4_CohortB_Subgroup.png`.
 - </w:t>
       </w:r>
       <w:r>
@@ -1106,7 +1251,7 @@
           <w:sz w:val="22"/>
           <w:szCs w:val="22"/>
         </w:rPr>
-        <w:t xml:space="preserve">. Love plot for Cohort A propensity score matching. File: `Data/cohort_a_psm_loveplot.png`.
+        <w:t xml:space="preserve">. Love plot — covariate balance before and after 1:1 propensity score matching (Cohort A). File: `Data/SupFigS1_loveplot_cohortA.png`.
 - </w:t>
       </w:r>
       <w:r>
@@ -1125,7 +1270,7 @@
           <w:sz w:val="22"/>
           <w:szCs w:val="22"/>
         </w:rPr>
-        <w:t xml:space="preserve">. Love plot for Cohort B fine matching. File: `Data/love_plot.png`.
+        <w:t xml:space="preserve">. Love plot — covariate balance before and after fine variable-ratio (1:up-to-4) matching (Cohort B). File: `Data/SupFigS2_loveplot_cohortB.png`.
 - </w:t>
       </w:r>
       <w:r>
@@ -1163,14 +1308,24 @@
           <w:sz w:val="22"/>
           <w:szCs w:val="22"/>
         </w:rPr>
-        <w:t xml:space="preserve">. Subgroup forest plot by age strata for Cohort B. File: `Data/figure3_subgroup_km.png`.
+        <w:t xml:space="preserve">. Schoenfeld residual plots for Cohort A primary models (Any-of-5, Diabetes). Files: `Data/PH_check_A_</w:t>
+      </w:r>
+      <w:r>
+        <w:rPr>
+          <w:rFonts w:ascii="Arial" w:cs="Arial" w:eastAsia="Arial" w:hAnsi="Arial"/>
+          <w:i/>
+          <w:iCs/>
+          <w:sz w:val="22"/>
+          <w:szCs w:val="22"/>
+        </w:rPr>
+        <w:t xml:space="preserve">.png`.
 - </w:t>
       </w:r>
       <w:r>
         <w:rPr>
           <w:rFonts w:ascii="Arial" w:cs="Arial" w:eastAsia="Arial" w:hAnsi="Arial"/>
-          <w:b/>
-          <w:bCs/>
+          <w:i/>
+          <w:iCs/>
           <w:sz w:val="22"/>
           <w:szCs w:val="22"/>
         </w:rPr>
@@ -1179,29 +1334,20 @@
       <w:r>
         <w:rPr>
           <w:rFonts w:ascii="Arial" w:cs="Arial" w:eastAsia="Arial" w:hAnsi="Arial"/>
-          <w:sz w:val="22"/>
-          <w:szCs w:val="22"/>
-        </w:rPr>
-        <w:t xml:space="preserve">. Schoenfeld residual plots for Cohort A primary models (Any-of-5, Diabetes). Files: `Data/PH_check_A_*.png`.
-- </w:t>
-      </w:r>
-      <w:r>
-        <w:rPr>
-          <w:rFonts w:ascii="Arial" w:cs="Arial" w:eastAsia="Arial" w:hAnsi="Arial"/>
-          <w:b/>
-          <w:bCs/>
-          <w:sz w:val="22"/>
-          <w:szCs w:val="22"/>
-        </w:rPr>
-        <w:t xml:space="preserve">Supplementary Figure S6</w:t>
-      </w:r>
-      <w:r>
-        <w:rPr>
-          <w:rFonts w:ascii="Arial" w:cs="Arial" w:eastAsia="Arial" w:hAnsi="Arial"/>
-          <w:sz w:val="22"/>
-          <w:szCs w:val="22"/>
-        </w:rPr>
-        <w:t xml:space="preserve">. Schoenfeld residual plots for Cohort B primary models (recurrence, HPV reinfection). Files: `Data/PH_check_B_*.png`.
+          <w:i/>
+          <w:iCs/>
+          <w:sz w:val="22"/>
+          <w:szCs w:val="22"/>
+        </w:rPr>
+        <w:t xml:space="preserve">. Schoenfeld residual plots for Cohort B primary models (recurrence, HPV reinfection). Files: `Data/PH_check_B_</w:t>
+      </w:r>
+      <w:r>
+        <w:rPr>
+          <w:rFonts w:ascii="Arial" w:cs="Arial" w:eastAsia="Arial" w:hAnsi="Arial"/>
+          <w:sz w:val="22"/>
+          <w:szCs w:val="22"/>
+        </w:rPr>
+        <w:t xml:space="preserve">.png`.
 - </w:t>
       </w:r>
       <w:r>
@@ -1239,7 +1385,7 @@
           <w:sz w:val="22"/>
           <w:szCs w:val="22"/>
         </w:rPr>
-        <w:t xml:space="preserve">. Propensity score model coefficients (logistic regression) for Cohort A. File: `Data/SupTableS2_ps_coefficients.docx`.
+        <w:t xml:space="preserve">. Propensity-score model coefficients (logistic regression) for Cohort A. File: `Data/SupTableS2_ps_coefficients.docx`.
 - </w:t>
       </w:r>
       <w:r>
@@ -1277,7 +1423,7 @@
           <w:sz w:val="22"/>
           <w:szCs w:val="22"/>
         </w:rPr>
-        <w:t xml:space="preserve">. Age- and follow-up-window-stratified subgroup analyses for Cohort B (recurrence). File: `Data/subgroup_analysis_comprehensive.csv`.
+        <w:t xml:space="preserve">. Age-stratified hazard ratios for Cohort B (lesion recurrence) across follow-up windows. File: `Data/SupTableS4_revised_age_fu_forest.docx` and `Data/CohortB_age_fu_forest.csv`. The full grid-search version (≈6,900 combinations) used to identify the post-hoc 30–52 year stratum is retained for transparency in `Data/sensitivity_age_cutoff.csv`.
 - </w:t>
       </w:r>
       <w:r>
@@ -1315,7 +1461,7 @@
           <w:sz w:val="22"/>
           <w:szCs w:val="22"/>
         </w:rPr>
-        <w:t xml:space="preserve">. Per-vaccine-type detailed results — both pairwise subgroup HRs and single-model interaction-derived HRs with the LRT for vaccine-type heterogeneity. Files: `Data/vaccine_type_analysis.csv`, `Data/CohortB_vaccine_interaction.csv`.
+        <w:t xml:space="preserve">. Per-vaccine-type detailed results — both pairwise subgroup hazard ratios and single-model interaction-derived hazard ratios with the LRT for vaccine-type heterogeneity. Files: `Data/vaccine_type_analysis.csv`, `Data/CohortB_vaccine_interaction.csv`.
 - </w:t>
       </w:r>
       <w:r>
@@ -1353,7 +1499,102 @@
           <w:sz w:val="22"/>
           <w:szCs w:val="22"/>
         </w:rPr>
-        <w:t xml:space="preserve">. Pseudo-index assignment sensitivity analysis for Cohort A (Any-of-five). File: `Data/CohortA_pseudoindex_sensitivity.csv`.</w:t>
+        <w:t xml:space="preserve">. Pseudo-index assignment sensitivity analysis for Cohort A (Any-of-five). File: `Data/CohortA_pseudoindex_sensitivity.csv`.
+- </w:t>
+      </w:r>
+      <w:r>
+        <w:rPr>
+          <w:rFonts w:ascii="Arial" w:cs="Arial" w:eastAsia="Arial" w:hAnsi="Arial"/>
+          <w:b/>
+          <w:bCs/>
+          <w:sz w:val="22"/>
+          <w:szCs w:val="22"/>
+        </w:rPr>
+        <w:t xml:space="preserve">Supplementary Table S9</w:t>
+      </w:r>
+      <w:r>
+        <w:rPr>
+          <w:rFonts w:ascii="Arial" w:cs="Arial" w:eastAsia="Arial" w:hAnsi="Arial"/>
+          <w:sz w:val="22"/>
+          <w:szCs w:val="22"/>
+        </w:rPr>
+        <w:t xml:space="preserve">. Dose-threshold sensitivity for both cohorts — re-fitted hazard ratios under ≥1, ≥2, and ≥3 (complete schedule) dose definitions. File: `Data/Sensitivity_DoseThreshold_HR.csv`.
+- </w:t>
+      </w:r>
+      <w:r>
+        <w:rPr>
+          <w:rFonts w:ascii="Arial" w:cs="Arial" w:eastAsia="Arial" w:hAnsi="Arial"/>
+          <w:b/>
+          <w:bCs/>
+          <w:sz w:val="22"/>
+          <w:szCs w:val="22"/>
+        </w:rPr>
+        <w:t xml:space="preserve">Supplementary Table S10</w:t>
+      </w:r>
+      <w:r>
+        <w:rPr>
+          <w:rFonts w:ascii="Arial" w:cs="Arial" w:eastAsia="Arial" w:hAnsi="Arial"/>
+          <w:sz w:val="22"/>
+          <w:szCs w:val="22"/>
+        </w:rPr>
+        <w:t xml:space="preserve">. Strict 1:4 fine-matching sensitivity for Cohort B — primary outcomes under the variable-ratio (primary) and strict (sensitivity) specifications. File: `Data/Sensitivity_StrictMatching.csv`.
+- </w:t>
+      </w:r>
+      <w:r>
+        <w:rPr>
+          <w:rFonts w:ascii="Arial" w:cs="Arial" w:eastAsia="Arial" w:hAnsi="Arial"/>
+          <w:b/>
+          <w:bCs/>
+          <w:sz w:val="22"/>
+          <w:szCs w:val="22"/>
+        </w:rPr>
+        <w:t xml:space="preserve">Supplementary Table S11</w:t>
+      </w:r>
+      <w:r>
+        <w:rPr>
+          <w:rFonts w:ascii="Arial" w:cs="Arial" w:eastAsia="Arial" w:hAnsi="Arial"/>
+          <w:sz w:val="22"/>
+          <w:szCs w:val="22"/>
+        </w:rPr>
+        <w:t xml:space="preserve">. Prescription-code vs. drug-name exposure-ascertainment cross-validation. File: `Data/Sensitivity_PrescriptionCode.csv`.
+- </w:t>
+      </w:r>
+      <w:r>
+        <w:rPr>
+          <w:rFonts w:ascii="Arial" w:cs="Arial" w:eastAsia="Arial" w:hAnsi="Arial"/>
+          <w:b/>
+          <w:bCs/>
+          <w:sz w:val="22"/>
+          <w:szCs w:val="22"/>
+        </w:rPr>
+        <w:t xml:space="preserve">Supplementary Table S12</w:t>
+      </w:r>
+      <w:r>
+        <w:rPr>
+          <w:rFonts w:ascii="Arial" w:cs="Arial" w:eastAsia="Arial" w:hAnsi="Arial"/>
+          <w:sz w:val="22"/>
+          <w:szCs w:val="22"/>
+        </w:rPr>
+        <w:t xml:space="preserve">. Vaccine-type recipient patterns including mixed-product recipients. File: `Data/Sensitivity_MixedVaccineType.csv`.
+- </w:t>
+      </w:r>
+      <w:r>
+        <w:rPr>
+          <w:rFonts w:ascii="Arial" w:cs="Arial" w:eastAsia="Arial" w:hAnsi="Arial"/>
+          <w:b/>
+          <w:bCs/>
+          <w:sz w:val="22"/>
+          <w:szCs w:val="22"/>
+        </w:rPr>
+        <w:t xml:space="preserve">Supplementary Table S13</w:t>
+      </w:r>
+      <w:r>
+        <w:rPr>
+          <w:rFonts w:ascii="Arial" w:cs="Arial" w:eastAsia="Arial" w:hAnsi="Arial"/>
+          <w:sz w:val="22"/>
+          <w:szCs w:val="22"/>
+        </w:rPr>
+        <w:t xml:space="preserve">. Landmark sensitivity analysis for the post-index hr-HPV detection outcome — re-estimated hazard ratios after advancing the at-risk clock to 6, 12, and 24 months post-index. File: `Data/Sensitivity_HPV_Landmark.csv`.</w:t>
       </w:r>
     </w:p>
     <w:p>
@@ -1435,7 +1676,7 @@
           <w:sz w:val="22"/>
           <w:szCs w:val="22"/>
         </w:rPr>
-        <w:t xml:space="preserve">(to be expanded)</w:t>
+        <w:t xml:space="preserve">outline (to be expanded)</w:t>
       </w:r>
     </w:p>
     <w:p>
@@ -1465,8 +1706,301 @@
           <w:sz w:val="22"/>
           <w:szCs w:val="22"/>
         </w:rPr>
-        <w:t xml:space="preserve">Limitations to be acknowledged include the single-centre design, the modest absolute number of cardiovascular events (limiting power for the MCE composite), the dependence of HPV reinfection ascertainment on opportunistic testing, the absence of granular data on socioeconomic status, sexual behaviour, and partner vaccination, and the residual potential for unmeasured confounding despite propensity score and fine matching. Several methodological caveats also merit explicit mention. First, the pseudo-index assignment used to anchor follow-up time for unvaccinated controls in Cohort A is not unique; we therefore conducted a sensitivity analysis comparing three reasonable strategies and observed concordant results. Second, the original 1:4 fine-matched Cohort B subgroup analysis by vaccine type reused non-vaccinated controls across pairwise comparisons; we addressed this by re-formulating the analysis as a single Cox model with vaccine-type × vaccination interaction terms and a likelihood-ratio test, which appropriately accounts for the dependence among controls and continues to support a Gardasil-specific signal for HPV reinfection. Third, with only two pre-specified primary outcomes in Cohort B we report Bonferroni-adjusted p-values and 97.5% confidence intervals; the subgroup and interaction findings are explicitly framed as hypothesis-generating. The combination of a long-followed prospective cohort with retrospective CDW augmentation is, however, a methodological strength that allowed us to track clinically important outcomes that would have been undetectable in shorter follow-up windows, while the use of cluster-robust standard errors based on the matched-pair (Cohort A) and fine-matching (Cohort B) identifiers, together with proportional-hazards assumption testing, provides a methodologically conservative inferential framework.</w:t>
-      </w:r>
+        <w:t xml:space="preserve">Limitations to be acknowledged include the single-centre design, the modest absolute number of cardiovascular events (limiting power for the MCE composite), the dependence of HPV reinfection ascertainment on opportunistic testing, the absence of granular data on socioeconomic status, sexual behaviour, and partner vaccination, the residual potential for unmeasured confounding despite propensity score and fine matching, and an important definitional caveat for the post-index hr-HPV detection outcome. Specifically, because the cohort consisted entirely of women who had been HPV-positive at the time of the qualifying surgery, and because residual viral DNA typically takes 12–18 months to clear, the operational definition of post-index hr-HPV positivity necessarily conflates persistence and reactivation of the pre-surgical infection with new acquisition; almost half of all post-index hr-HPV+ records arose within the first 6 months, a pattern incompatible with a true incident-acquisition interpretation. The landmark sensitivity analysis indicates that, once these early detections are excluded, no protective association with vaccination remains, and we therefore caution against interpreting the primary HR of 0.91 as evidence of vaccine efficacy against new HPV infection. A definitive evaluation of vaccine efficacy against new acquisition would require either a documented HPV-negative test before counting subsequent positivity as a new event, or genotyping that distinguishes the post-surgical types from the index-surgery types — neither of which was uniformly available in the present cohort. Several methodological caveats also merit explicit mention. First, the pseudo-index assignment used to anchor follow-up time for unvaccinated controls in Cohort A is not unique; we therefore conducted a sensitivity analysis comparing three reasonable strategies and observed concordant results. Second, the original variable-ratio (1:up-to-4) fine-matched Cohort B subgroup analysis by vaccine type reused non-vaccinated controls across pairwise comparisons; we addressed this by re-formulating the analysis as a single Cox model with vaccine-type × vaccination interaction terms and a likelihood-ratio test, which appropriately accounts for the dependence among controls and continues to support a Gardasil-specific signal for HPV reinfection. Third, we did not apply formal multiple-comparison adjustment for the two Cohort B primary outcomes because they represent distinct biological hypotheses (lesion recurrence versus de novo viral acquisition); both, however, were null at the nominal threshold, so any plausible adjustment would not alter the substantive conclusion. The subgroup and interaction findings are explicitly framed as hypothesis-generating; in particular, an exploratory grid search across many overlapping age and follow-up windows had identified a single nominally significant cell (women aged 30 to 52 years, 2-year follow-up window: hazard ratio 0.23, 95% CI 0.06 to 0.96) that did not survive any reasonable adjustment for the approximately 6,900 combinations searched, attenuated with longer follow-up, and is therefore not reported in the main figure and not used to support any inference. Fourth, the post-surgical efficacy analysis was conducted with limited statistical power: only 13 lesion recurrences accrued in the vaccinated arm, so the analysis was sensitive to detect protective effects only of magnitude approximately HR ≤ 0.5 at 80% power. This limitation is intrinsic to the rarity of the outcome in a Korean post-surgical population and not to the matching strategy itself. The combination of a long-followed prospective cohort with retrospective CDW augmentation is, however, a methodological strength that allowed us to track clinically important outcomes that would have been undetectable in shorter follow-up windows, while the use of cluster-robust standard errors based on the matched-pair (Cohort A) and fine-matching (Cohort B) identifiers, together with proportional-hazards assumption testing, provides a methodologically conservative inferential framework.</w:t>
+      </w:r>
+    </w:p>
+    <w:p>
+      <w:pPr>
+        <w:pageBreakBefore/>
+        <w:spacing w:after="200" w:line="360"/>
+        <w:jc w:val="left"/>
+      </w:pPr>
+      <w:r>
+        <w:rPr>
+          <w:rFonts w:ascii="Arial" w:cs="Arial" w:eastAsia="Arial" w:hAnsi="Arial"/>
+          <w:b/>
+          <w:bCs/>
+          <w:sz w:val="28"/>
+          <w:szCs w:val="28"/>
+        </w:rPr>
+        <w:t xml:space="preserve">References</w:t>
+      </w:r>
+    </w:p>
+    <w:p>
+      <w:pPr>
+        <w:spacing w:after="0" w:line="360"/>
+        <w:ind/>
+        <w:jc w:val="both"/>
+      </w:pPr>
+      <w:r>
+        <w:rPr>
+          <w:rFonts w:ascii="Arial" w:cs="Arial" w:eastAsia="Arial" w:hAnsi="Arial"/>
+          <w:sz w:val="22"/>
+          <w:szCs w:val="22"/>
+        </w:rPr>
+        <w:t xml:space="preserve">1. von Elm E, Altman DG, Egger M, Pocock SJ, Gøtzsche PC, Vandenbroucke JP; STROBE Initiative. The Strengthening the Reporting of Observational Studies in Epidemiology (STROBE) statement: guidelines for reporting observational studies. </w:t>
+      </w:r>
+      <w:r>
+        <w:rPr>
+          <w:rFonts w:ascii="Arial" w:cs="Arial" w:eastAsia="Arial" w:hAnsi="Arial"/>
+          <w:i/>
+          <w:iCs/>
+          <w:sz w:val="22"/>
+          <w:szCs w:val="22"/>
+        </w:rPr>
+        <w:t xml:space="preserve">Lancet.</w:t>
+      </w:r>
+      <w:r>
+        <w:rPr>
+          <w:rFonts w:ascii="Arial" w:cs="Arial" w:eastAsia="Arial" w:hAnsi="Arial"/>
+          <w:sz w:val="22"/>
+          <w:szCs w:val="22"/>
+        </w:rPr>
+        <w:t xml:space="preserve"> 2007;370(9596):1453-1457. doi:</w:t>
+      </w:r>
+      <w:r>
+        <w:rPr>
+          <w:rFonts w:ascii="Arial" w:cs="Arial" w:eastAsia="Arial" w:hAnsi="Arial"/>
+          <w:sz w:val="22"/>
+          <w:szCs w:val="22"/>
+        </w:rPr>
+        <w:t xml:space="preserve">10.1016/S0140-6736(07)61602-X</w:t>
+      </w:r>
+      <w:r>
+        <w:rPr>
+          <w:rFonts w:ascii="Arial" w:cs="Arial" w:eastAsia="Arial" w:hAnsi="Arial"/>
+          <w:sz w:val="22"/>
+          <w:szCs w:val="22"/>
+        </w:rPr>
+        <w:t xml:space="preserve">61602-X)</w:t>
+      </w:r>
+    </w:p>
+    <w:p>
+      <w:pPr>
+        <w:spacing w:after="0" w:line="480"/>
+      </w:pPr>
+    </w:p>
+    <w:p>
+      <w:pPr>
+        <w:spacing w:after="0" w:line="360"/>
+        <w:ind/>
+        <w:jc w:val="both"/>
+      </w:pPr>
+      <w:r>
+        <w:rPr>
+          <w:rFonts w:ascii="Arial" w:cs="Arial" w:eastAsia="Arial" w:hAnsi="Arial"/>
+          <w:sz w:val="22"/>
+          <w:szCs w:val="22"/>
+        </w:rPr>
+        <w:t xml:space="preserve">2. Austin PC. Optimal caliper widths for propensity-score matching when estimating differences in means and differences in proportions in observational studies. </w:t>
+      </w:r>
+      <w:r>
+        <w:rPr>
+          <w:rFonts w:ascii="Arial" w:cs="Arial" w:eastAsia="Arial" w:hAnsi="Arial"/>
+          <w:i/>
+          <w:iCs/>
+          <w:sz w:val="22"/>
+          <w:szCs w:val="22"/>
+        </w:rPr>
+        <w:t xml:space="preserve">Pharm Stat.</w:t>
+      </w:r>
+      <w:r>
+        <w:rPr>
+          <w:rFonts w:ascii="Arial" w:cs="Arial" w:eastAsia="Arial" w:hAnsi="Arial"/>
+          <w:sz w:val="22"/>
+          <w:szCs w:val="22"/>
+        </w:rPr>
+        <w:t xml:space="preserve"> 2011;10(2):150-161. doi:</w:t>
+      </w:r>
+      <w:r>
+        <w:rPr>
+          <w:rFonts w:ascii="Arial" w:cs="Arial" w:eastAsia="Arial" w:hAnsi="Arial"/>
+          <w:sz w:val="22"/>
+          <w:szCs w:val="22"/>
+        </w:rPr>
+        <w:t xml:space="preserve">10.1002/pst.433</w:t>
+      </w:r>
+    </w:p>
+    <w:p>
+      <w:pPr>
+        <w:spacing w:after="0" w:line="480"/>
+      </w:pPr>
+    </w:p>
+    <w:p>
+      <w:pPr>
+        <w:spacing w:after="0" w:line="360"/>
+        <w:ind/>
+        <w:jc w:val="both"/>
+      </w:pPr>
+      <w:r>
+        <w:rPr>
+          <w:rFonts w:ascii="Arial" w:cs="Arial" w:eastAsia="Arial" w:hAnsi="Arial"/>
+          <w:sz w:val="22"/>
+          <w:szCs w:val="22"/>
+        </w:rPr>
+        <w:t xml:space="preserve">3. Geskus RB. Cause-specific cumulative incidence estimation and the Fine and Gray model under both left truncation and right censoring. </w:t>
+      </w:r>
+      <w:r>
+        <w:rPr>
+          <w:rFonts w:ascii="Arial" w:cs="Arial" w:eastAsia="Arial" w:hAnsi="Arial"/>
+          <w:i/>
+          <w:iCs/>
+          <w:sz w:val="22"/>
+          <w:szCs w:val="22"/>
+        </w:rPr>
+        <w:t xml:space="preserve">Biometrics.</w:t>
+      </w:r>
+      <w:r>
+        <w:rPr>
+          <w:rFonts w:ascii="Arial" w:cs="Arial" w:eastAsia="Arial" w:hAnsi="Arial"/>
+          <w:sz w:val="22"/>
+          <w:szCs w:val="22"/>
+        </w:rPr>
+        <w:t xml:space="preserve"> 2011;67(1):39-49. doi:</w:t>
+      </w:r>
+      <w:r>
+        <w:rPr>
+          <w:rFonts w:ascii="Arial" w:cs="Arial" w:eastAsia="Arial" w:hAnsi="Arial"/>
+          <w:sz w:val="22"/>
+          <w:szCs w:val="22"/>
+        </w:rPr>
+        <w:t xml:space="preserve">10.1111/j.1541-0420.2010.01420.x</w:t>
+      </w:r>
+    </w:p>
+    <w:p>
+      <w:pPr>
+        <w:spacing w:after="0" w:line="480"/>
+      </w:pPr>
+    </w:p>
+    <w:p>
+      <w:pPr>
+        <w:spacing w:after="0" w:line="360"/>
+        <w:ind/>
+        <w:jc w:val="both"/>
+      </w:pPr>
+      <w:r>
+        <w:rPr>
+          <w:rFonts w:ascii="Arial" w:cs="Arial" w:eastAsia="Arial" w:hAnsi="Arial"/>
+          <w:sz w:val="22"/>
+          <w:szCs w:val="22"/>
+        </w:rPr>
+        <w:t xml:space="preserve">4. Rothman KJ. No adjustments are needed for multiple comparisons. </w:t>
+      </w:r>
+      <w:r>
+        <w:rPr>
+          <w:rFonts w:ascii="Arial" w:cs="Arial" w:eastAsia="Arial" w:hAnsi="Arial"/>
+          <w:i/>
+          <w:iCs/>
+          <w:sz w:val="22"/>
+          <w:szCs w:val="22"/>
+        </w:rPr>
+        <w:t xml:space="preserve">Epidemiology.</w:t>
+      </w:r>
+      <w:r>
+        <w:rPr>
+          <w:rFonts w:ascii="Arial" w:cs="Arial" w:eastAsia="Arial" w:hAnsi="Arial"/>
+          <w:sz w:val="22"/>
+          <w:szCs w:val="22"/>
+        </w:rPr>
+        <w:t xml:space="preserve"> 1990;1(1):43-46.</w:t>
+      </w:r>
+    </w:p>
+    <w:p>
+      <w:pPr>
+        <w:spacing w:after="0" w:line="480"/>
+      </w:pPr>
+    </w:p>
+    <w:p>
+      <w:pPr>
+        <w:spacing w:after="0" w:line="360"/>
+        <w:ind/>
+        <w:jc w:val="both"/>
+      </w:pPr>
+      <w:r>
+        <w:rPr>
+          <w:rFonts w:ascii="Arial" w:cs="Arial" w:eastAsia="Arial" w:hAnsi="Arial"/>
+          <w:sz w:val="22"/>
+          <w:szCs w:val="22"/>
+        </w:rPr>
+        <w:t xml:space="preserve">5. Stuart EA. Matching methods for causal inference: a review and a look forward. </w:t>
+      </w:r>
+      <w:r>
+        <w:rPr>
+          <w:rFonts w:ascii="Arial" w:cs="Arial" w:eastAsia="Arial" w:hAnsi="Arial"/>
+          <w:i/>
+          <w:iCs/>
+          <w:sz w:val="22"/>
+          <w:szCs w:val="22"/>
+        </w:rPr>
+        <w:t xml:space="preserve">Stat Sci.</w:t>
+      </w:r>
+      <w:r>
+        <w:rPr>
+          <w:rFonts w:ascii="Arial" w:cs="Arial" w:eastAsia="Arial" w:hAnsi="Arial"/>
+          <w:sz w:val="22"/>
+          <w:szCs w:val="22"/>
+        </w:rPr>
+        <w:t xml:space="preserve"> 2010;25(1):1-21. doi:</w:t>
+      </w:r>
+      <w:r>
+        <w:rPr>
+          <w:rFonts w:ascii="Arial" w:cs="Arial" w:eastAsia="Arial" w:hAnsi="Arial"/>
+          <w:sz w:val="22"/>
+          <w:szCs w:val="22"/>
+        </w:rPr>
+        <w:t xml:space="preserve">10.1214/09-STS313</w:t>
+      </w:r>
+    </w:p>
+    <w:p>
+      <w:pPr>
+        <w:spacing w:after="0" w:line="480"/>
+      </w:pPr>
+    </w:p>
+    <w:p>
+      <w:pPr>
+        <w:spacing w:after="0" w:line="360"/>
+        <w:ind/>
+        <w:jc w:val="both"/>
+      </w:pPr>
+      <w:r>
+        <w:rPr>
+          <w:rFonts w:ascii="Arial" w:cs="Arial" w:eastAsia="Arial" w:hAnsi="Arial"/>
+          <w:sz w:val="22"/>
+          <w:szCs w:val="22"/>
+        </w:rPr>
+        <w:t xml:space="preserve">6. Austin PC. A comparison of 12 algorithms for matching on the propensity score. </w:t>
+      </w:r>
+      <w:r>
+        <w:rPr>
+          <w:rFonts w:ascii="Arial" w:cs="Arial" w:eastAsia="Arial" w:hAnsi="Arial"/>
+          <w:i/>
+          <w:iCs/>
+          <w:sz w:val="22"/>
+          <w:szCs w:val="22"/>
+        </w:rPr>
+        <w:t xml:space="preserve">Stat Med.</w:t>
+      </w:r>
+      <w:r>
+        <w:rPr>
+          <w:rFonts w:ascii="Arial" w:cs="Arial" w:eastAsia="Arial" w:hAnsi="Arial"/>
+          <w:sz w:val="22"/>
+          <w:szCs w:val="22"/>
+        </w:rPr>
+        <w:t xml:space="preserve"> 2014;33(6):1057-1069. doi:</w:t>
+      </w:r>
+      <w:r>
+        <w:rPr>
+          <w:rFonts w:ascii="Arial" w:cs="Arial" w:eastAsia="Arial" w:hAnsi="Arial"/>
+          <w:sz w:val="22"/>
+          <w:szCs w:val="22"/>
+        </w:rPr>
+        <w:t xml:space="preserve">10.1002/sim.6004</w:t>
+      </w:r>
+    </w:p>
+    <w:p>
+      <w:pPr>
+        <w:spacing w:after="0" w:line="480"/>
+      </w:pPr>
     </w:p>
     <w:sectPr>
       <w:headerReference w:type="default" r:id="rId7"/>

</xml_diff>